<commit_message>
Release 2026.10.13.05: barcode editing UX, GS1/UDI, manuals and verified customer package
</commit_message>
<xml_diff>
--- a/개발소스/채움랩_라벨출력패키지_고객용_매뉴얼.docx
+++ b/개발소스/채움랩_라벨출력패키지_고객용_매뉴얼.docx
@@ -422,7 +422,7 @@
                 <w:color w:val="111827"/>
                 <w:sz w:val="20"/>
               </w:rPr>
-              <w:t>3.0 / 2026.10.06.01</w:t>
+              <w:t>3.0 / 2026.10.13.05</w:t>
             </w:r>
           </w:p>
         </w:tc>
@@ -1263,7 +1263,7 @@
                 <w:color w:val="111827"/>
                 <w:sz w:val="20"/>
               </w:rPr>
-              <w:t>config.ini가 자동으로 갱신됩니다.</w:t>
+              <w:t>config.ini가 자동으로 갱신되고 열린 디자이너·출력 관리에 공통 규격이 반영됩니다.</w:t>
             </w:r>
           </w:p>
         </w:tc>
@@ -1582,7 +1582,7 @@
           <w:color w:val="111827"/>
           <w:sz w:val="22"/>
         </w:rPr>
-        <w:t>2026.10.06.01 실제 프로그램 화면. 창 크기와 Windows 배율에 따라 패널 폭과 표시 위치가 달라질 수 있습니다.</w:t>
+        <w:t>2026.10.13.05 실제 프로그램 화면. 창 크기와 Windows 배율에 따라 패널 폭과 표시 위치가 달라질 수 있습니다.</w:t>
       </w:r>
     </w:p>
     <w:p>
@@ -1687,7 +1687,7 @@
           <w:color w:val="111827"/>
           <w:sz w:val="22"/>
         </w:rPr>
-        <w:t>2026.10.06.01 실제 프로그램 화면. 창 크기와 Windows 배율에 따라 패널 폭과 표시 위치가 달라질 수 있습니다.</w:t>
+        <w:t>2026.10.13.05 실제 프로그램 화면. 창 크기와 Windows 배율에 따라 패널 폭과 표시 위치가 달라질 수 있습니다.</w:t>
       </w:r>
     </w:p>
     <w:p>
@@ -1792,7 +1792,7 @@
           <w:color w:val="111827"/>
           <w:sz w:val="22"/>
         </w:rPr>
-        <w:t>2026.10.06.01 실제 프로그램 화면. 창 크기와 Windows 배율에 따라 패널 폭과 표시 위치가 달라질 수 있습니다.</w:t>
+        <w:t>2026.10.13.05 실제 프로그램 화면. 창 크기와 Windows 배율에 따라 패널 폭과 표시 위치가 달라질 수 있습니다.</w:t>
       </w:r>
     </w:p>
     <w:p>
@@ -6798,7 +6798,7 @@
                 <w:color w:val="111827"/>
                 <w:sz w:val="20"/>
               </w:rPr>
-              <w:t>인쇄를 눌러 1~100장의 매수를 지정하고 대상 건수를 확인한 뒤 인쇄 시작을 누릅니다.</w:t>
+              <w:t>인쇄를 눌러 1 이상의 정수 매수를 지정하고 대상 건수를 확인한 뒤 인쇄 시작을 누릅니다.</w:t>
             </w:r>
           </w:p>
         </w:tc>
@@ -6908,7 +6908,7 @@
           <w:color w:val="111827"/>
           <w:sz w:val="22"/>
         </w:rPr>
-        <w:t xml:space="preserve"> 선택 없이 인쇄 버튼을 누르면 전체 항목이 대상입니다. 인쇄 전에는 항상 1~100장의 인쇄 매수 선택 창이 열립니다. 대상·총 매수를 확인하고 취소하면 프린터 명령을 보내지 않습니다. 이번 매수는 임시 큐에만 적용되며 원본 DB와 기본 print_queue.xlsx의 저장값은 바뀌지 않습니다.</w:t>
+        <w:t xml:space="preserve"> 선택 없이 인쇄 버튼을 누르면 전체 항목이 대상입니다. 인쇄 전에는 항상 양의 정수를 입력하는 인쇄 매수 선택 창이 열립니다. 100장·1,000장 같은 임의 상한은 없습니다. 대상·총 매수를 확인하고 시작 전 취소하면 프린터 명령을 보내지 않습니다. 전송 중 중단은 미전송 작업만 멈추며 이미 프린터가 받은 작업의 중단은 보장하지 않습니다. 이번 매수는 임시 큐에만 적용되며 원본 DB와 기본 print_queue.xlsx의 저장값은 바뀌지 않습니다.</w:t>
       </w:r>
     </w:p>
     <w:p>
@@ -7269,7 +7269,7 @@
                 <w:color w:val="111827"/>
                 <w:sz w:val="20"/>
               </w:rPr>
-              <w:t>실제 용지의 가로·세로(mm)를 입력하고 텍스트, 1D/2D 바코드, 그림, 박스, 선, 표를 넣습니다. 개체를 더블클릭해 크기와 위치를 확인합니다. 오른쪽은 상품 DB 메뉴만 표시합니다. 상단 좌우 가운데 정렬·상하 가운데 정렬로 가로·세로 중심에 배치합니다.</w:t>
+              <w:t>용지 설정에서 실제 가로·세로(mm)를 저장합니다. 디자이너 상단은 공통 규격을 읽기 전용으로 보여 줍니다. 아이콘과 이름이 함께 표시된 개체 도구에서 텍스트, 1D/2D 바코드, 그림, 박스, 선, 표를 넣습니다. 개체를 더블클릭해 크기와 위치를 확인합니다. 오른쪽은 상품 DB 메뉴만 표시합니다. 상단 좌우 가운데 정렬·상하 가운데 정렬로 가로·세로 중심에 배치합니다.</w:t>
             </w:r>
           </w:p>
         </w:tc>
@@ -7470,7 +7470,7 @@
           <w:color w:val="111827"/>
           <w:sz w:val="22"/>
         </w:rPr>
-        <w:t>Ctrl+클릭으로 여러 개체를 선택합니다. 개체는 더블클릭으로 수정하고 좌우·상하 가운데 정렬은 상단에서 실행합니다. 방향키는 1mm, Shift+방향키는 0.1mm씩 이동합니다. 화면 맞춤과 확대·축소는 보기 크기만 바꿉니다.</w:t>
+        <w:t>Ctrl+클릭으로 여러 개체를 선택합니다. Ctrl+C로 복사, Ctrl+V로 붙여넣기, Ctrl+D로 복제합니다. 글자 입력칸에 포커스가 있으면 해당 글자를 복사·붙여넣기합니다. 그림과 DB 연결도 개체 복사에 포함됩니다. 개체는 더블클릭으로 수정하고 좌우·상하 가운데 정렬은 상단에서 실행합니다. 방향키는 1mm, Shift+방향키는 0.1mm씩 이동합니다. 화면 맞춤과 확대·축소는 보기 크기만 바꿉니다.</w:t>
       </w:r>
     </w:p>
     <w:p>
@@ -7483,7 +7483,7 @@
           <w:color w:val="111827"/>
           <w:sz w:val="22"/>
         </w:rPr>
-        <w:t>Ctrl+Z는 실행취소, Ctrl+Y는 다시실행입니다. 저장하지 않은 변경사항은 파일명과 창 제목의 *로 보입니다. 비정상 종료 후 복구 제안이 나타나면 저장한 원본을 덮어쓰지 않는 작업 사본으로 확인합니다.</w:t>
+        <w:t>다른 규격의 도안을 열면 기존 규격 유지 또는 공통 규격 적용을 선택합니다. 개체가 영역 밖으로 나가는 크기 변경은 취소되고 기존 도안을 유지합니다. Ctrl+Z는 실행취소, Ctrl+Y는 다시실행입니다. 저장하지 않은 변경사항은 파일명과 창 제목의 *로 보입니다. 비정상 종료 후 복구 제안이 나타나면 저장한 원본을 덮어쓰지 않는 작업 사본으로 확인합니다.</w:t>
       </w:r>
     </w:p>
     <w:p>
@@ -11152,6 +11152,223 @@
         </w:tc>
       </w:tr>
     </w:tbl>
+    <w:p>
+      <w:r>
+        <w:br w:type="page"/>
+      </w:r>
+    </w:p>
+    <w:p>
+      <w:pPr>
+        <w:pStyle w:val="Heading1"/>
+      </w:pPr>
+      <w:r>
+        <w:t>GS1 응용식별자와 바코드 세부 옵션</w:t>
+      </w:r>
+    </w:p>
+    <w:p>
+      <w:r>
+        <w:t>바코드 종류를 선택하고 바코드 세부 옵션에서 해당 종류의 크기, 체크숫자, 오류복원, 버전, 행·열 등 지원 옵션을 설정합니다. GS1 데이터 구성 (AI)에서 AI를 검색하고 고정값 또는 DB 열을 연결한 뒤 데이터 검증과 적용을 누릅니다.</w:t>
+      </w:r>
+    </w:p>
+    <w:p>
+      <w:r>
+        <w:t>표시문자에는 AI 괄호를 표시하고 실제 데이터에는 필요한 GS 구분자를 자동으로 넣습니다. GTIN 체크숫자, 길이, 날짜와 AI 조합을 검증하며 URL이나 긴 문자열을 임의로 제거하거나 잘라내지 않습니다. 라벨에 실제 도트 크기가 들어가지 않으면 출력을 차단합니다.</w:t>
+      </w:r>
+    </w:p>
+    <w:p>
+      <w:r>
+        <w:t>80개 선택 항목을 제공하며 BarTender 공식 69개 형식 주제 중 57개에 대응합니다. iQR, 2D Pharmacode, Anker, 원형 바코드 4종, Code 93i, NEC 2 of 5, OPC, PosiCode, Singapore Post는 미지원입니다. BarTender의 모든 참조 옵션과 완전 동등한 제품은 아닙니다. 실제 프린터와 스캐너로 첫 장을 확인하세요.</w:t>
+      </w:r>
+    </w:p>
+    <w:p>
+      <w:r>
+        <w:t>새 AI와 선택한 GS1 행의 입력 변경은 데이터 검증·적용 전에 자동 반영합니다. 취소하면 원본은 유지됩니다. AI21 일련번호의 필수 조합 오류는 필수 AI 선택에서 01·03·8006 중 해당 상품의 실제 식별번호 또는 DB 열을 추가하여 해결합니다. 자주 사용하는 AI와 한국어 검색을 사용할 수 있습니다.</w:t>
+      </w:r>
+    </w:p>
+    <w:p>
+      <w:r>
+        <w:br w:type="page"/>
+      </w:r>
+    </w:p>
+    <w:p>
+      <w:pPr>
+        <w:pStyle w:val="Heading1"/>
+      </w:pPr>
+      <w:r>
+        <w:t>현재 도안과 반복 출력 연결</w:t>
+      </w:r>
+    </w:p>
+    <w:p>
+      <w:r>
+        <w:t>디자이너에서 도안을 저장한 뒤 보기 &gt; 반복 출력 화면 또는 상단 반복 출력을 누릅니다. 출력 관리에서 선택 도안 이름과 현재 도안 미리보기를 확인합니다. 출력 도안 선택으로 .cllabel을 직접 지정할 수 있으며 자동 기본 배치 사용은 프린터 설정의 기본 배치로 변경합니다. 두 모드를 구분하고 출력 대상·매수를 확인하세요.</w:t>
+      </w:r>
+    </w:p>
+    <w:p>
+      <w:r>
+        <w:t>상품 엑셀 연결에서 사용할 파일과 시트를 고릅니다. 도안에는 연결 파일 경로·시트·열·변경 확인값을 저장하며 엑셀의 전체 고객 행을 복사하지 않습니다. 원본 참조와 가져온 복사본, 연결 시각을 확인하고 파일이 이동하거나 바뀌면 재연결 또는 엑셀 새로고침 후 열 연결을 검증합니다. 전체 데이터 검증에서 행·개체·원인을 한 번에 확인합니다.</w:t>
+      </w:r>
+    </w:p>
+    <w:p>
+      <w:pPr>
+        <w:pStyle w:val="Heading2"/>
+      </w:pPr>
+      <w:r>
+        <w:t>일련번호·날짜·문자 생성</w:t>
+      </w:r>
+    </w:p>
+    <w:p>
+      <w:r>
+        <w:t>디자이너 도구 &gt; 값 생성 규칙에서 일련번호, 날짜 / 기한, 문자 붙이기, 부분 추출을 추가합니다. 생성 필드는 {{필드 이름}} 또는 GS1의 DB 열로 연결합니다. 일련번호 시작 번호·증가량·자리수·같은 번호의 복사 수와 작업마다 시작/계속 발급을 지정합니다. 날짜는 작업 날짜 또는 DB 날짜에 일수를 더하고 출력 형식을 정합니다. 규칙을 적용한 뒤 도안을 저장합니다.</w:t>
+      </w:r>
+    </w:p>
+    <w:p>
+      <w:r>
+        <w:t>4장 미리보기는 번호를 소비하지 않습니다. 인쇄 확인 후 확정한 값과 기준일은 작업 기록으로 보존하며 재개·재인쇄 시 새 날짜나 번호를 자동 계산하지 않습니다. 전송 결과가 불확실하면 실제 출력물을 먼저 확인하고 기존 값 재인쇄와 새 번호 발급을 구분하세요.</w:t>
+      </w:r>
+    </w:p>
+    <w:p>
+      <w:r>
+        <w:t>고객 데이터 백업에는 out/value_jobs/ledger.json의 발급·재인쇄 기록을 포함합니다. 나머지 out 로그와 지원 ZIP은 포함하지 않습니다. 발급 중 잠금, 기록 손상, 현재 번호보다 오래된 백업, 누락된 작업 기록은 안전을 위해 복원을 차단합니다. 기록을 지워 우회하지 말고 최신 백업과 실제 사용 번호를 확인하세요.</w:t>
+      </w:r>
+    </w:p>
+    <w:p>
+      <w:pPr>
+        <w:pStyle w:val="Heading2"/>
+      </w:pPr>
+      <w:r>
+        <w:t>GS1 데이터 표시와 재인쇄</w:t>
+      </w:r>
+    </w:p>
+    <w:p>
+      <w:r>
+        <w:t>GS1 DataMatrix의 표시문자를 켜면 AI별 데이터를 표시합니다. 새 배치에서는 문자 위치를 오른쪽 또는 아래로 선택합니다. GS1-128은 아래에 AI 괄호를 포함한 전체 값을 표시합니다. 값은 자동으로 잘라내거나 문자를 제거하지 않습니다. 괄호는 표시용이며 바코드에 인코딩하지 않습니다.</w:t>
+      </w:r>
+    </w:p>
+    <w:p>
+      <w:r>
+        <w:t>마지막 생성 작업 재인쇄는 저장된 값과 기준일을 재사용하며 번호를 소비하지 않습니다. 원본 엑셀이 없어도 원래 도안 버전으로 재인쇄할 수 있습니다. 번호 발급 초기화는 중복 위험을 확인하고 필요한 필드에만 적용하세요.</w:t>
+      </w:r>
+    </w:p>
+    <w:p>
+      <w:pPr>
+        <w:pStyle w:val="Heading2"/>
+      </w:pPr>
+      <w:r>
+        <w:t>2D 바코드 크기 우선과 표시문자 배치</w:t>
+      </w:r>
+    </w:p>
+    <w:p>
+      <w:r>
+        <w:t>2D 개체를 더블클릭하여 2D 크기·문자 배치의 크기 방식을 확인합니다. 새 2D 개체는 바코드 크기 우선으로 시작합니다. 기존 도안은 기존 배치를 유지하며 바코드 크기 우선을 선택하여 명시적으로 전환합니다. 1D의 기존 배치는 유지합니다.</w:t>
+      </w:r>
+    </w:p>
+    <w:p>
+      <w:r>
+        <w:t>바코드 한 변(mm) 또는 바코드 가로(mm)·바코드 세로(mm)는 필수 여백을 포함하고 표시문자를 제외한 바코드 영역의 목표입니다. 코드 원래 비율과 정수 모듈 도트를 보존하므로 실제 크기는 목표와 다를 수 있습니다. 실제 크기 확인에서 현재 데이터와 출력 DPI에 따른 실제 mm·모듈 도트를 확인합니다. 모듈 크기 고정은 도트를 기준으로 하며 mm 목표와 동시에 독립 편집하지 않습니다.</w:t>
+      </w:r>
+    </w:p>
+    <w:p>
+      <w:r>
+        <w:t>문자 위치는 오른쪽 또는 아래, 문자 간격(mm)은 필수 여백 바깥 간격입니다. 문자 크기는 자동 맞춤 또는 지정 크기를 선택합니다. 표시문자·글꼴·위치를 바꾸어도 확정한 바코드 크기는 유지됩니다. 개체 전체 가로·세로는 코드와 문자를 함께 담는 영역입니다. 전체 가로·세로는 배치 결과에서 계산합니다. 문자 공간 오류 중에도 코드 크기 조절·이동·실행취소를 할 수 있습니다. 현재 라벨에 맞추기 또는 문자 아래 배치로 해결한 뒤 다시 검증합니다. 바코드를 자동 축소하거나 값을 잘라 해결하지 않습니다.</w:t>
+      </w:r>
+    </w:p>
+    <w:p>
+      <w:r>
+        <w:t>라벨 경계 또는 데이터별 모듈 크기 오류는 인쇄 전에 수정해야 합니다. 목표 mm는 모든 GS1 용도의 승인값이 아닙니다. 저장 도안과 반복 출력 미리보기·인쇄파일을 확인하고 실제 프린터·스캐너에서 첫 장의 위치·값·판독을 확인하세요.</w:t>
+      </w:r>
+    </w:p>
+    <w:p>
+      <w:pPr>
+        <w:pStyle w:val="Heading2"/>
+      </w:pPr>
+      <w:r>
+        <w:t>AI·의료기기 UDI 통합 편집</w:t>
+      </w:r>
+    </w:p>
+    <w:p>
+      <w:r>
+        <w:t>바코드를 더블클릭해 바코드 속성을 엽니다. 데이터 원본에서 일반 데이터를 입력하고 바코드 종류·크기와 표시문자에서 바코드 종류와 배치를 조정합니다. GS1·UDI 구성은 데이터 원본의 GS1 데이터로 설정… 버튼 또는 기타 데이터 옵션…에서 필요할 때만 엽니다. ‘시험용 완성 예제로 시작’은 시험용 데이터이며 실제 운영 전 발급·관리하는 번호 또는 DB 열로 교체합니다. 필수 AI 선택은 부족한 조합을 함께 보여 줍니다. 새 AI와 수정 중인 행은 검증·적용 전에 자동 반영하며 임의의 실제 번호를 채우지 않습니다.</w:t>
+      </w:r>
+    </w:p>
+    <w:p>
+      <w:r>
+        <w:t>한 AI의 값 칸에는 값만 넣습니다. 전체 문자열의 AI 괄호 또는 스캐너 구분자는 전체 GS1 데이터 가져오기에서 처리하고 결과의 선행 0·항목·값을 확인합니다. AI21과 AI37의 필요한 조합은 서로 다르므로 모든 항목에 같은 식별번호 AI를 넣지 않습니다.</w:t>
+      </w:r>
+    </w:p>
+    <w:p>
+      <w:r>
+        <w:t>의료기기 UDI는 GS1과 HIBC 프로필을 구분합니다. 제품 식별번호(DI)와 로트·일련번호·제조일·사용기한(PI)을 한글 필드에 입력하고 고정값 또는 DB 열을 선택합니다. HIBC는 원본으로 생성과 완성 코드 가져오기를 구분하며 완성 원문의 +접두·전체 체크문자·공백을 임의로 삭제하거나 중복 추가하지 않습니다. 표시문자와 확정 코드 데이터를 대조합니다.</w:t>
+      </w:r>
+    </w:p>
+    <w:p>
+      <w:r>
+        <w:t>선택 기호 생성 검증에서 긴 UDI가 GS1-128 용량을 넘으면 데이터를 보존한 채 GS1 DataMatrix 전환을 검토합니다. 필수 필드를 삭제하거나 데이터를 잘라 해결하지 않습니다. 국내 프로필은 기관 등록·규제 승인 완료를 뜻하지 않습니다. Basic UDI-DI는 GTIN과 별도 정보입니다. UDI 선택은 편집 초안에만 반영됩니다. 창 하단의 적용 또는 확인으로 저장합니다. 취소, Esc 또는 창 닫기는 마지막 적용 상태를 보존합니다.</w:t>
+      </w:r>
+    </w:p>
+    <w:p>
+      <w:r>
+        <w:t>정사각형은 바코드 한 변(mm), 직사각형은 원래 비율로 가로·세로·대각선 손잡이를 조절합니다. 목표 mm와 정수 도트 기준 실제 mm·모듈 도트를 확인합니다. 문자 공간·라벨 경계 오류 중에도 코드 그림·크기 조절·이동·실행취소는 유지합니다. 현재 라벨에 맞추기와 문자 아래 배치를 검토한 뒤 다시 확인합니다. 모듈 크기 고정은 도트 설정으로 조절하며 손잡이는 잠깁니다. 미해결 오류는 인쇄를 차단합니다.</w:t>
+      </w:r>
+    </w:p>
+    <w:p>
+      <w:r>
+        <w:br w:type="page"/>
+      </w:r>
+    </w:p>
+    <w:p>
+      <w:pPr>
+        <w:pStyle w:val="Heading1"/>
+      </w:pPr>
+      <w:r>
+        <w:t>UDI 통합 입력창 실제 화면</w:t>
+      </w:r>
+    </w:p>
+    <w:p>
+      <w:r>
+        <w:t>바코드 속성은 데이터 원본부터 열립니다. 직접 입력 또는 DB / 엑셀 연결을 선택하고 첫 화면의 GS1 데이터로 설정…을 사용합니다. 의료기기 UDI는 기타 데이터 옵션…에서 선택합니다. 상단 미리보기 버튼을 눌러 DB 행·실제 인코딩 값·표시문자·DPI·실제 mm를 확인하며 전체 보기·100%·확대 보기를 사용할 수 있습니다. 원본별 입력 초안은 전환해도 유지됩니다. 적용과 확인은 창 하단에서 한 번만 수행합니다.</w:t>
+      </w:r>
+    </w:p>
+    <w:p>
+      <w:r>
+        <w:drawing>
+          <wp:inline xmlns:a="http://schemas.openxmlformats.org/drawingml/2006/main" xmlns:pic="http://schemas.openxmlformats.org/drawingml/2006/picture">
+            <wp:extent cx="5943600" cy="4312024"/>
+            <wp:docPr id="8" name="Picture 8"/>
+            <wp:cNvGraphicFramePr>
+              <a:graphicFrameLocks noChangeAspect="1"/>
+            </wp:cNvGraphicFramePr>
+            <a:graphic>
+              <a:graphicData uri="http://schemas.openxmlformats.org/drawingml/2006/picture">
+                <pic:pic>
+                  <pic:nvPicPr>
+                    <pic:cNvPr id="0" name="frozen-udi-content.png"/>
+                    <pic:cNvPicPr/>
+                  </pic:nvPicPr>
+                  <pic:blipFill>
+                    <a:blip r:embed="rId18"/>
+                    <a:stretch>
+                      <a:fillRect/>
+                    </a:stretch>
+                  </pic:blipFill>
+                  <pic:spPr>
+                    <a:xfrm>
+                      <a:off x="0" y="0"/>
+                      <a:ext cx="5943600" cy="4312024"/>
+                    </a:xfrm>
+                    <a:prstGeom prst="rect"/>
+                  </pic:spPr>
+                </pic:pic>
+              </a:graphicData>
+            </a:graphic>
+          </wp:inline>
+        </w:drawing>
+      </w:r>
+    </w:p>
+    <w:p>
+      <w:r>
+        <w:t>UDI 구성 화면에서 DI/PI를 입력하고 바코드 속성의 바코드 종류·크기와 표시문자에서 실제 크기를 확인합니다. 편집창을 적용한 뒤 메인 화면의 전체 데이터 검증으로 모든 DB 행을 검사합니다. 시험용 예제 번호를 실제 고객 발급값으로 사용하지 마세요.</w:t>
+      </w:r>
+    </w:p>
     <w:sectPr>
       <w:footerReference w:type="default" r:id="rId9"/>
       <w:headerReference w:type="default" r:id="rId10"/>
@@ -11178,7 +11395,7 @@
         <w:color w:val="68747C"/>
         <w:sz w:val="17"/>
       </w:rPr>
-      <w:t>채움랩 라벨 출력 패키지 고객용 매뉴얼 | Rev. 2026.10.06.01</w:t>
+      <w:t>채움랩 라벨 출력 패키지 고객용 매뉴얼 | Rev. 2026.10.13.05</w:t>
     </w:r>
     <w:r>
       <w:t xml:space="preserve"> | </w:t>

</xml_diff>